<commit_message>
✨ feat: create templates for nomaddocs organization
</commit_message>
<xml_diff>
--- a/apps/web/templates/XANSHA/Lease Agreement.docx
+++ b/apps/web/templates/XANSHA/Lease Agreement.docx
@@ -348,7 +348,6 @@
         <w:t xml:space="preserve">{formattedDateFrom}</w:t>
       </w:r>
       <w:r/>
-      <w:r/>
     </w:p>
     <w:p>
       <w:pPr>
@@ -414,27 +413,61 @@
       </w:r>
       <w:r>
         <w:rPr>
-          <w:rFonts w:hint="default"/>
+          <w:b w:val="0"/>
+          <w:bCs w:val="0"/>
+          <w:sz w:val="24"/>
+          <w:szCs w:val="24"/>
+          <w:lang w:val="en-US"/>
         </w:rPr>
-        <w:t xml:space="preserve">Филиал Акционерного общества «Национальная компания «Қазақстан темір жолы» - «Центр диагностики пути»</w:t>
+        <w:t xml:space="preserve">{</w:t>
+      </w:r>
+      <w:r>
+        <w:rPr>
+          <w:rFonts w:hint="default" w:ascii="Times New Roman" w:hAnsi="Times New Roman"/>
+          <w:b w:val="0"/>
+          <w:bCs w:val="0"/>
+          <w:sz w:val="24"/>
+          <w:szCs w:val="24"/>
+          <w:lang w:val="en-US"/>
+        </w:rPr>
+        <w:t xml:space="preserve">organization</w:t>
+      </w:r>
+      <w:r>
+        <w:rPr>
+          <w:b w:val="0"/>
+          <w:bCs w:val="0"/>
+          <w:sz w:val="24"/>
+          <w:szCs w:val="24"/>
+          <w:lang w:val="en-US"/>
+        </w:rPr>
+        <w:t xml:space="preserve">.</w:t>
+      </w:r>
+      <w:r>
+        <w:rPr>
+          <w:rFonts w:hint="default" w:ascii="Times New Roman" w:hAnsi="Times New Roman"/>
+          <w:b w:val="0"/>
+          <w:bCs w:val="0"/>
+          <w:sz w:val="24"/>
+          <w:szCs w:val="24"/>
+          <w:lang w:val="en-US"/>
+        </w:rPr>
+        <w:t xml:space="preserve">organization</w:t>
+      </w:r>
+      <w:r>
+        <w:rPr>
+          <w:b w:val="0"/>
+          <w:bCs w:val="0"/>
+          <w:sz w:val="24"/>
+          <w:szCs w:val="24"/>
+          <w:lang w:val="en-US"/>
+        </w:rPr>
+        <w:t xml:space="preserve">}</w:t>
       </w:r>
       <w:r>
         <w:t xml:space="preserve"> в лице </w:t>
       </w:r>
       <w:r>
-        <w:rPr>
-          <w:lang w:val="en-US"/>
-        </w:rPr>
-      </w:r>
-      <w:r/>
-      <w:r>
         <w:t xml:space="preserve">{customer.fullnameClient}</w:t>
-      </w:r>
-      <w:r/>
-      <w:r>
-        <w:rPr>
-          <w:lang w:val="en-US"/>
-        </w:rPr>
       </w:r>
       <w:r>
         <w:t xml:space="preserve"> уд№</w:t>
@@ -1831,15 +1864,16 @@
                 <w:b/>
                 <w:sz w:val="20"/>
                 <w:szCs w:val="20"/>
-                <w:lang w:val="en-US"/>
               </w:rPr>
             </w:r>
             <w:r>
               <w:rPr>
                 <w:rFonts w:ascii="Times New Roman" w:hAnsi="Times New Roman" w:cs="Times New Roman"/>
                 <w:b/>
+                <w:bCs/>
                 <w:sz w:val="20"/>
                 <w:szCs w:val="20"/>
+                <w:lang w:val="en-US"/>
               </w:rPr>
             </w:r>
           </w:p>
@@ -1923,15 +1957,6 @@
                 <w:sz w:val="20"/>
                 <w:szCs w:val="20"/>
               </w:rPr>
-            </w:r>
-            <w:r/>
-            <w:r>
-              <w:rPr>
-                <w:rFonts w:ascii="Times New Roman" w:hAnsi="Times New Roman" w:cs="Times New Roman"/>
-                <w:b/>
-                <w:sz w:val="20"/>
-                <w:szCs w:val="20"/>
-              </w:rPr>
               <w:t xml:space="preserve">уд№</w:t>
             </w:r>
             <w:r>
@@ -2004,20 +2029,11 @@
             </w:r>
             <w:r>
               <w:rPr>
-                <w:rFonts w:hint="default" w:ascii="Times New Roman" w:hAnsi="Times New Roman" w:cs="Times New Roman"/>
+                <w:rFonts w:ascii="Times New Roman" w:hAnsi="Times New Roman" w:cs="Times New Roman"/>
                 <w:b/>
+                <w:bCs/>
                 <w:sz w:val="20"/>
                 <w:szCs w:val="20"/>
-                <w:lang w:val="ru-RU"/>
-              </w:rPr>
-            </w:r>
-            <w:r>
-              <w:rPr>
-                <w:rFonts w:hint="default" w:ascii="Times New Roman" w:hAnsi="Times New Roman" w:cs="Times New Roman"/>
-                <w:b/>
-                <w:sz w:val="20"/>
-                <w:szCs w:val="20"/>
-                <w:lang w:val="ru-RU"/>
               </w:rPr>
             </w:r>
             <w:r>
@@ -2059,6 +2075,12 @@
                 <w:lang w:val="en-US"/>
               </w:rPr>
               <w:t xml:space="preserve">{customer.iin}</w:t>
+            </w:r>
+            <w:r>
+              <w:rPr>
+                <w:rFonts w:ascii="Times New Roman" w:hAnsi="Times New Roman" w:cs="Times New Roman"/>
+                <w:b/>
+              </w:rPr>
             </w:r>
             <w:r>
               <w:rPr>
@@ -33927,7 +33949,7 @@
     <customSectPr/>
   </customSectProps>
   <customShpExts>
-    <customShpInfo spid="_x005F_x005F_x005F_x005F_x005F_x005F_x005F_x0000_s1026"/>
+    <customShpInfo spid="_x005F_x005F_x005F_x005F_x005F_x005F_x005F_x005F_x005F_x005F_x005F_x005F_x005F_x005F_x005F_x0000_s1026"/>
   </customShpExts>
 </s:customData>
 </file>

</xml_diff>